<commit_message>
Update template fonts + fix non-numeric ID crash
- 模板.docx: User-adjusted font styles
- db_query.py: Safe int conversion for non-numeric ID fields (fixes ValueError
  when loading databases with string IDs like '建议：请疾')
- db_query.py: cmd_get handles non-numeric IDs with string SQL clause
</commit_message>
<xml_diff>
--- a/模板.docx
+++ b/模板.docx
@@ -104,7 +104,7 @@
             <w:pPr>
               <w:jc w:val="center"/>
               <w:rPr>
-                <w:rFonts w:ascii="仿宋_GB2312" w:hAnsi="仿宋_GB2312" w:eastAsia="仿宋_GB2312" w:cs="仿宋_GB2312"/>
+                <w:rFonts w:hint="eastAsia" w:ascii="仿宋_GB2312" w:hAnsi="仿宋_GB2312" w:eastAsia="仿宋_GB2312" w:cs="仿宋_GB2312"/>
                 <w:color w:val="FF0000"/>
                 <w:sz w:val="28"/>
                 <w:szCs w:val="28"/>
@@ -136,6 +136,11 @@
             <w:pPr>
               <w:spacing w:before="0" w:after="0" w:line="240" w:lineRule="auto"/>
               <w:ind w:firstLine="560"/>
+              <w:rPr>
+                <w:rFonts w:hint="eastAsia" w:ascii="仿宋_GB2312" w:hAnsi="仿宋_GB2312" w:eastAsia="仿宋_GB2312" w:cs="仿宋_GB2312"/>
+                <w:sz w:val="28"/>
+                <w:szCs w:val="28"/>
+              </w:rPr>
             </w:pPr>
           </w:p>
         </w:tc>
@@ -175,7 +180,7 @@
             <w:pPr>
               <w:jc w:val="center"/>
               <w:rPr>
-                <w:rFonts w:ascii="仿宋_GB2312" w:hAnsi="仿宋_GB2312" w:eastAsia="仿宋_GB2312" w:cs="仿宋_GB2312"/>
+                <w:rFonts w:hint="eastAsia" w:ascii="仿宋_GB2312" w:hAnsi="仿宋_GB2312" w:eastAsia="仿宋_GB2312" w:cs="仿宋_GB2312"/>
                 <w:color w:val="FF0000"/>
                 <w:sz w:val="28"/>
                 <w:szCs w:val="28"/>
@@ -207,6 +212,11 @@
             <w:pPr>
               <w:spacing w:before="0" w:after="0" w:line="240" w:lineRule="auto"/>
               <w:jc w:val="center"/>
+              <w:rPr>
+                <w:rFonts w:hint="eastAsia" w:ascii="仿宋_GB2312" w:hAnsi="仿宋_GB2312" w:eastAsia="仿宋_GB2312" w:cs="仿宋_GB2312"/>
+                <w:sz w:val="28"/>
+                <w:szCs w:val="28"/>
+              </w:rPr>
             </w:pPr>
           </w:p>
         </w:tc>
@@ -225,7 +235,7 @@
             <w:pPr>
               <w:jc w:val="center"/>
               <w:rPr>
-                <w:rFonts w:ascii="仿宋_GB2312" w:hAnsi="仿宋_GB2312" w:eastAsia="仿宋_GB2312" w:cs="仿宋_GB2312"/>
+                <w:rFonts w:hint="eastAsia" w:ascii="仿宋_GB2312" w:hAnsi="仿宋_GB2312" w:eastAsia="仿宋_GB2312" w:cs="仿宋_GB2312"/>
                 <w:color w:val="FF0000"/>
                 <w:sz w:val="28"/>
                 <w:szCs w:val="28"/>
@@ -257,6 +267,11 @@
             <w:pPr>
               <w:spacing w:before="0" w:after="0" w:line="240" w:lineRule="auto"/>
               <w:jc w:val="center"/>
+              <w:rPr>
+                <w:rFonts w:hint="eastAsia" w:ascii="仿宋_GB2312" w:hAnsi="仿宋_GB2312" w:eastAsia="仿宋_GB2312" w:cs="仿宋_GB2312"/>
+                <w:sz w:val="28"/>
+                <w:szCs w:val="28"/>
+              </w:rPr>
             </w:pPr>
           </w:p>
         </w:tc>
@@ -296,7 +311,7 @@
             <w:pPr>
               <w:jc w:val="center"/>
               <w:rPr>
-                <w:rFonts w:ascii="仿宋_GB2312" w:hAnsi="仿宋_GB2312" w:eastAsia="仿宋_GB2312" w:cs="仿宋_GB2312"/>
+                <w:rFonts w:hint="eastAsia" w:ascii="仿宋_GB2312" w:hAnsi="仿宋_GB2312" w:eastAsia="仿宋_GB2312" w:cs="仿宋_GB2312"/>
                 <w:color w:val="FF0000"/>
                 <w:sz w:val="28"/>
                 <w:szCs w:val="28"/>
@@ -328,6 +343,11 @@
             <w:pPr>
               <w:spacing w:before="0" w:after="0" w:line="240" w:lineRule="auto"/>
               <w:jc w:val="center"/>
+              <w:rPr>
+                <w:rFonts w:hint="eastAsia" w:ascii="仿宋_GB2312" w:hAnsi="仿宋_GB2312" w:eastAsia="仿宋_GB2312" w:cs="仿宋_GB2312"/>
+                <w:sz w:val="28"/>
+                <w:szCs w:val="28"/>
+              </w:rPr>
             </w:pPr>
           </w:p>
         </w:tc>
@@ -346,7 +366,7 @@
             <w:pPr>
               <w:jc w:val="center"/>
               <w:rPr>
-                <w:rFonts w:ascii="仿宋_GB2312" w:hAnsi="仿宋_GB2312" w:eastAsia="仿宋_GB2312" w:cs="仿宋_GB2312"/>
+                <w:rFonts w:hint="eastAsia" w:ascii="仿宋_GB2312" w:hAnsi="仿宋_GB2312" w:eastAsia="仿宋_GB2312" w:cs="仿宋_GB2312"/>
                 <w:color w:val="FF0000"/>
                 <w:sz w:val="28"/>
                 <w:szCs w:val="28"/>
@@ -378,6 +398,11 @@
             <w:pPr>
               <w:spacing w:before="0" w:after="0" w:line="240" w:lineRule="auto"/>
               <w:jc w:val="center"/>
+              <w:rPr>
+                <w:rFonts w:hint="eastAsia" w:ascii="仿宋_GB2312" w:hAnsi="仿宋_GB2312" w:eastAsia="仿宋_GB2312" w:cs="仿宋_GB2312"/>
+                <w:sz w:val="28"/>
+                <w:szCs w:val="28"/>
+              </w:rPr>
             </w:pPr>
           </w:p>
         </w:tc>
@@ -417,7 +442,7 @@
             <w:pPr>
               <w:jc w:val="center"/>
               <w:rPr>
-                <w:rFonts w:ascii="仿宋_GB2312" w:hAnsi="仿宋_GB2312" w:eastAsia="仿宋_GB2312" w:cs="仿宋_GB2312"/>
+                <w:rFonts w:hint="eastAsia" w:ascii="仿宋_GB2312" w:hAnsi="仿宋_GB2312" w:eastAsia="仿宋_GB2312" w:cs="仿宋_GB2312"/>
                 <w:color w:val="FF0000"/>
                 <w:sz w:val="28"/>
                 <w:szCs w:val="28"/>
@@ -448,7 +473,7 @@
             <w:pPr>
               <w:jc w:val="center"/>
               <w:rPr>
-                <w:rFonts w:ascii="仿宋_GB2312" w:hAnsi="仿宋_GB2312" w:eastAsia="仿宋_GB2312" w:cs="仿宋_GB2312"/>
+                <w:rFonts w:hint="eastAsia" w:ascii="仿宋_GB2312" w:hAnsi="仿宋_GB2312" w:eastAsia="仿宋_GB2312" w:cs="仿宋_GB2312"/>
                 <w:color w:val="FF0000"/>
                 <w:sz w:val="28"/>
                 <w:szCs w:val="28"/>
@@ -471,7 +496,7 @@
             <w:pPr>
               <w:jc w:val="center"/>
               <w:rPr>
-                <w:rFonts w:ascii="仿宋_GB2312" w:hAnsi="仿宋_GB2312" w:eastAsia="仿宋_GB2312" w:cs="仿宋_GB2312"/>
+                <w:rFonts w:hint="eastAsia" w:ascii="仿宋_GB2312" w:hAnsi="仿宋_GB2312" w:eastAsia="仿宋_GB2312" w:cs="仿宋_GB2312"/>
                 <w:color w:val="FF0000"/>
                 <w:sz w:val="28"/>
                 <w:szCs w:val="28"/>
@@ -503,7 +528,7 @@
             <w:pPr>
               <w:jc w:val="center"/>
               <w:rPr>
-                <w:rFonts w:ascii="仿宋_GB2312" w:hAnsi="仿宋_GB2312" w:eastAsia="仿宋_GB2312" w:cs="仿宋_GB2312"/>
+                <w:rFonts w:hint="eastAsia" w:ascii="仿宋_GB2312" w:hAnsi="仿宋_GB2312" w:eastAsia="仿宋_GB2312" w:cs="仿宋_GB2312"/>
                 <w:color w:val="FF0000"/>
                 <w:sz w:val="28"/>
                 <w:szCs w:val="28"/>
@@ -526,7 +551,7 @@
             <w:pPr>
               <w:jc w:val="center"/>
               <w:rPr>
-                <w:rFonts w:ascii="仿宋_GB2312" w:hAnsi="仿宋_GB2312" w:eastAsia="仿宋_GB2312" w:cs="仿宋_GB2312"/>
+                <w:rFonts w:hint="eastAsia" w:ascii="仿宋_GB2312" w:hAnsi="仿宋_GB2312" w:eastAsia="仿宋_GB2312" w:cs="仿宋_GB2312"/>
                 <w:color w:val="FF0000"/>
                 <w:sz w:val="28"/>
                 <w:szCs w:val="28"/>
@@ -558,6 +583,11 @@
             <w:pPr>
               <w:spacing w:before="0" w:after="0" w:line="240" w:lineRule="auto"/>
               <w:jc w:val="center"/>
+              <w:rPr>
+                <w:rFonts w:hint="eastAsia" w:ascii="仿宋_GB2312" w:hAnsi="仿宋_GB2312" w:eastAsia="仿宋_GB2312" w:cs="仿宋_GB2312"/>
+                <w:sz w:val="28"/>
+                <w:szCs w:val="28"/>
+              </w:rPr>
             </w:pPr>
           </w:p>
         </w:tc>
@@ -598,7 +628,7 @@
             <w:pPr>
               <w:jc w:val="center"/>
               <w:rPr>
-                <w:rFonts w:ascii="仿宋_GB2312" w:hAnsi="仿宋_GB2312" w:eastAsia="仿宋_GB2312" w:cs="仿宋_GB2312"/>
+                <w:rFonts w:hint="eastAsia" w:ascii="仿宋_GB2312" w:hAnsi="仿宋_GB2312" w:eastAsia="仿宋_GB2312" w:cs="仿宋_GB2312"/>
                 <w:color w:val="FF0000"/>
                 <w:sz w:val="28"/>
                 <w:szCs w:val="28"/>
@@ -630,7 +660,14 @@
             <w:pPr>
               <w:spacing w:before="0" w:after="0" w:line="240" w:lineRule="auto"/>
               <w:ind w:firstLine="560"/>
-            </w:pPr>
+              <w:rPr>
+                <w:rFonts w:hint="eastAsia" w:ascii="仿宋_GB2312" w:hAnsi="仿宋_GB2312" w:eastAsia="仿宋_GB2312" w:cs="仿宋_GB2312"/>
+                <w:sz w:val="28"/>
+                <w:szCs w:val="28"/>
+              </w:rPr>
+            </w:pPr>
+            <w:bookmarkStart w:id="0" w:name="_GoBack"/>
+            <w:bookmarkEnd w:id="0"/>
           </w:p>
         </w:tc>
       </w:tr>
@@ -670,7 +707,7 @@
             <w:pPr>
               <w:jc w:val="center"/>
               <w:rPr>
-                <w:rFonts w:ascii="仿宋_GB2312" w:hAnsi="仿宋_GB2312" w:eastAsia="仿宋_GB2312" w:cs="仿宋_GB2312"/>
+                <w:rFonts w:hint="eastAsia" w:ascii="仿宋_GB2312" w:hAnsi="仿宋_GB2312" w:eastAsia="仿宋_GB2312" w:cs="仿宋_GB2312"/>
                 <w:color w:val="FF0000"/>
                 <w:sz w:val="28"/>
                 <w:szCs w:val="28"/>
@@ -698,7 +735,25 @@
             <w:shd w:val="clear" w:color="auto" w:fill="auto"/>
             <w:vAlign w:val="center"/>
           </w:tcPr>
-          <w:p/>
+          <w:p>
+            <w:pPr>
+              <w:rPr>
+                <w:rFonts w:hint="eastAsia" w:ascii="仿宋_GB2312" w:hAnsi="仿宋_GB2312" w:eastAsia="仿宋_GB2312" w:cs="仿宋_GB2312"/>
+                <w:sz w:val="28"/>
+                <w:szCs w:val="28"/>
+                <w:lang w:val="en-US" w:eastAsia="zh-CN"/>
+              </w:rPr>
+            </w:pPr>
+            <w:r>
+              <w:rPr>
+                <w:rFonts w:hint="eastAsia" w:ascii="仿宋_GB2312" w:hAnsi="仿宋_GB2312" w:eastAsia="仿宋_GB2312" w:cs="仿宋_GB2312"/>
+                <w:sz w:val="28"/>
+                <w:szCs w:val="28"/>
+                <w:lang w:val="en-US" w:eastAsia="zh-CN"/>
+              </w:rPr>
+              <w:t xml:space="preserve">    </w:t>
+            </w:r>
+          </w:p>
         </w:tc>
       </w:tr>
       <w:tr>
@@ -737,7 +792,7 @@
             <w:pPr>
               <w:jc w:val="center"/>
               <w:rPr>
-                <w:rFonts w:ascii="仿宋_GB2312" w:hAnsi="仿宋_GB2312" w:eastAsia="仿宋_GB2312" w:cs="仿宋_GB2312"/>
+                <w:rFonts w:hint="eastAsia" w:ascii="仿宋_GB2312" w:hAnsi="仿宋_GB2312" w:eastAsia="仿宋_GB2312" w:cs="仿宋_GB2312"/>
                 <w:color w:val="FF0000"/>
                 <w:sz w:val="28"/>
                 <w:szCs w:val="28"/>
@@ -769,6 +824,12 @@
             <w:pPr>
               <w:spacing w:before="0" w:after="0" w:line="560" w:lineRule="exact"/>
               <w:ind w:firstLine="560"/>
+              <w:rPr>
+                <w:rFonts w:hint="eastAsia" w:ascii="仿宋_GB2312" w:hAnsi="仿宋_GB2312" w:eastAsia="仿宋_GB2312" w:cs="仿宋_GB2312"/>
+                <w:sz w:val="28"/>
+                <w:szCs w:val="28"/>
+                <w:lang w:val="en-US" w:eastAsia="zh-CN"/>
+              </w:rPr>
             </w:pPr>
           </w:p>
         </w:tc>
@@ -809,7 +870,7 @@
             <w:pPr>
               <w:jc w:val="center"/>
               <w:rPr>
-                <w:rFonts w:ascii="仿宋_GB2312" w:hAnsi="仿宋_GB2312" w:eastAsia="仿宋_GB2312" w:cs="仿宋_GB2312"/>
+                <w:rFonts w:hint="eastAsia" w:ascii="仿宋_GB2312" w:hAnsi="仿宋_GB2312" w:eastAsia="仿宋_GB2312" w:cs="仿宋_GB2312"/>
                 <w:color w:val="FF0000"/>
                 <w:sz w:val="28"/>
                 <w:szCs w:val="28"/>
@@ -840,7 +901,7 @@
             <w:pPr>
               <w:jc w:val="center"/>
               <w:rPr>
-                <w:rFonts w:ascii="仿宋_GB2312" w:hAnsi="仿宋_GB2312" w:eastAsia="仿宋_GB2312" w:cs="仿宋_GB2312"/>
+                <w:rFonts w:hint="eastAsia" w:ascii="仿宋_GB2312" w:hAnsi="仿宋_GB2312" w:eastAsia="仿宋_GB2312" w:cs="仿宋_GB2312"/>
                 <w:color w:val="FF0000"/>
                 <w:sz w:val="28"/>
                 <w:szCs w:val="28"/>
@@ -872,7 +933,7 @@
             <w:pPr>
               <w:jc w:val="center"/>
               <w:rPr>
-                <w:rFonts w:ascii="仿宋_GB2312" w:hAnsi="仿宋_GB2312" w:eastAsia="仿宋_GB2312" w:cs="仿宋_GB2312"/>
+                <w:rFonts w:hint="eastAsia" w:ascii="仿宋_GB2312" w:hAnsi="仿宋_GB2312" w:eastAsia="仿宋_GB2312" w:cs="仿宋_GB2312"/>
                 <w:color w:val="FF0000"/>
                 <w:sz w:val="28"/>
                 <w:szCs w:val="28"/>
@@ -895,7 +956,7 @@
             <w:pPr>
               <w:jc w:val="center"/>
               <w:rPr>
-                <w:rFonts w:ascii="仿宋_GB2312" w:hAnsi="仿宋_GB2312" w:eastAsia="仿宋_GB2312" w:cs="仿宋_GB2312"/>
+                <w:rFonts w:hint="eastAsia" w:ascii="仿宋_GB2312" w:hAnsi="仿宋_GB2312" w:eastAsia="仿宋_GB2312" w:cs="仿宋_GB2312"/>
                 <w:color w:val="FF0000"/>
                 <w:sz w:val="28"/>
                 <w:szCs w:val="28"/>
@@ -918,7 +979,7 @@
             <w:pPr>
               <w:jc w:val="center"/>
               <w:rPr>
-                <w:rFonts w:ascii="仿宋_GB2312" w:hAnsi="仿宋_GB2312" w:eastAsia="仿宋_GB2312" w:cs="仿宋_GB2312"/>
+                <w:rFonts w:hint="eastAsia" w:ascii="仿宋_GB2312" w:hAnsi="仿宋_GB2312" w:eastAsia="仿宋_GB2312" w:cs="仿宋_GB2312"/>
                 <w:color w:val="FF0000"/>
                 <w:sz w:val="28"/>
                 <w:szCs w:val="28"/>
@@ -941,7 +1002,7 @@
             <w:pPr>
               <w:jc w:val="center"/>
               <w:rPr>
-                <w:rFonts w:ascii="仿宋_GB2312" w:hAnsi="仿宋_GB2312" w:eastAsia="仿宋_GB2312" w:cs="仿宋_GB2312"/>
+                <w:rFonts w:hint="eastAsia" w:ascii="仿宋_GB2312" w:hAnsi="仿宋_GB2312" w:eastAsia="仿宋_GB2312" w:cs="仿宋_GB2312"/>
                 <w:color w:val="FF0000"/>
                 <w:sz w:val="28"/>
                 <w:szCs w:val="28"/>
@@ -963,7 +1024,7 @@
             <w:pPr>
               <w:jc w:val="center"/>
               <w:rPr>
-                <w:rFonts w:ascii="仿宋_GB2312" w:hAnsi="仿宋_GB2312" w:eastAsia="仿宋_GB2312" w:cs="仿宋_GB2312"/>
+                <w:rFonts w:hint="eastAsia" w:ascii="仿宋_GB2312" w:hAnsi="仿宋_GB2312" w:eastAsia="仿宋_GB2312" w:cs="仿宋_GB2312"/>
                 <w:color w:val="FF0000"/>
                 <w:sz w:val="28"/>
                 <w:szCs w:val="28"/>
@@ -985,7 +1046,7 @@
             <w:pPr>
               <w:jc w:val="center"/>
               <w:rPr>
-                <w:rFonts w:ascii="仿宋_GB2312" w:hAnsi="仿宋_GB2312" w:eastAsia="仿宋_GB2312" w:cs="仿宋_GB2312"/>
+                <w:rFonts w:hint="eastAsia" w:ascii="仿宋_GB2312" w:hAnsi="仿宋_GB2312" w:eastAsia="仿宋_GB2312" w:cs="仿宋_GB2312"/>
                 <w:color w:val="FF0000"/>
                 <w:sz w:val="28"/>
                 <w:szCs w:val="28"/>
@@ -1030,7 +1091,7 @@
             <w:pPr>
               <w:jc w:val="center"/>
               <w:rPr>
-                <w:rFonts w:ascii="仿宋_GB2312" w:hAnsi="仿宋_GB2312" w:eastAsia="仿宋_GB2312" w:cs="仿宋_GB2312"/>
+                <w:rFonts w:hint="eastAsia" w:ascii="仿宋_GB2312" w:hAnsi="仿宋_GB2312" w:eastAsia="仿宋_GB2312" w:cs="仿宋_GB2312"/>
                 <w:color w:val="FF0000"/>
                 <w:sz w:val="28"/>
                 <w:szCs w:val="28"/>
@@ -1052,7 +1113,7 @@
             <w:pPr>
               <w:jc w:val="center"/>
               <w:rPr>
-                <w:rFonts w:ascii="仿宋_GB2312" w:hAnsi="仿宋_GB2312" w:eastAsia="仿宋_GB2312" w:cs="仿宋_GB2312"/>
+                <w:rFonts w:hint="eastAsia" w:ascii="仿宋_GB2312" w:hAnsi="仿宋_GB2312" w:eastAsia="仿宋_GB2312" w:cs="仿宋_GB2312"/>
                 <w:color w:val="FF0000"/>
                 <w:sz w:val="28"/>
                 <w:szCs w:val="28"/>
@@ -1084,7 +1145,7 @@
             <w:pPr>
               <w:jc w:val="center"/>
               <w:rPr>
-                <w:rFonts w:ascii="仿宋_GB2312" w:hAnsi="仿宋_GB2312" w:eastAsia="仿宋_GB2312" w:cs="仿宋_GB2312"/>
+                <w:rFonts w:hint="eastAsia" w:ascii="仿宋_GB2312" w:hAnsi="仿宋_GB2312" w:eastAsia="仿宋_GB2312" w:cs="仿宋_GB2312"/>
                 <w:color w:val="FF0000"/>
                 <w:sz w:val="28"/>
                 <w:szCs w:val="28"/>
@@ -1107,7 +1168,7 @@
             <w:pPr>
               <w:jc w:val="center"/>
               <w:rPr>
-                <w:rFonts w:ascii="仿宋_GB2312" w:hAnsi="仿宋_GB2312" w:eastAsia="仿宋_GB2312" w:cs="仿宋_GB2312"/>
+                <w:rFonts w:hint="eastAsia" w:ascii="仿宋_GB2312" w:hAnsi="仿宋_GB2312" w:eastAsia="仿宋_GB2312" w:cs="仿宋_GB2312"/>
                 <w:color w:val="FF0000"/>
                 <w:sz w:val="28"/>
                 <w:szCs w:val="28"/>
@@ -1130,7 +1191,7 @@
             <w:pPr>
               <w:jc w:val="center"/>
               <w:rPr>
-                <w:rFonts w:ascii="仿宋_GB2312" w:hAnsi="仿宋_GB2312" w:eastAsia="仿宋_GB2312" w:cs="仿宋_GB2312"/>
+                <w:rFonts w:hint="eastAsia" w:ascii="仿宋_GB2312" w:hAnsi="仿宋_GB2312" w:eastAsia="仿宋_GB2312" w:cs="仿宋_GB2312"/>
                 <w:color w:val="FF0000"/>
                 <w:sz w:val="28"/>
                 <w:szCs w:val="28"/>
@@ -1153,7 +1214,7 @@
             <w:pPr>
               <w:jc w:val="center"/>
               <w:rPr>
-                <w:rFonts w:ascii="仿宋_GB2312" w:hAnsi="仿宋_GB2312" w:eastAsia="仿宋_GB2312" w:cs="仿宋_GB2312"/>
+                <w:rFonts w:hint="eastAsia" w:ascii="仿宋_GB2312" w:hAnsi="仿宋_GB2312" w:eastAsia="仿宋_GB2312" w:cs="仿宋_GB2312"/>
                 <w:color w:val="FF0000"/>
                 <w:sz w:val="28"/>
                 <w:szCs w:val="28"/>
@@ -1175,7 +1236,7 @@
             <w:pPr>
               <w:jc w:val="center"/>
               <w:rPr>
-                <w:rFonts w:ascii="仿宋_GB2312" w:hAnsi="仿宋_GB2312" w:eastAsia="仿宋_GB2312" w:cs="仿宋_GB2312"/>
+                <w:rFonts w:hint="eastAsia" w:ascii="仿宋_GB2312" w:hAnsi="仿宋_GB2312" w:eastAsia="仿宋_GB2312" w:cs="仿宋_GB2312"/>
                 <w:color w:val="FF0000"/>
                 <w:sz w:val="28"/>
                 <w:szCs w:val="28"/>
@@ -1197,7 +1258,7 @@
             <w:pPr>
               <w:jc w:val="center"/>
               <w:rPr>
-                <w:rFonts w:ascii="仿宋_GB2312" w:hAnsi="仿宋_GB2312" w:eastAsia="仿宋_GB2312" w:cs="仿宋_GB2312"/>
+                <w:rFonts w:hint="eastAsia" w:ascii="仿宋_GB2312" w:hAnsi="仿宋_GB2312" w:eastAsia="仿宋_GB2312" w:cs="仿宋_GB2312"/>
                 <w:color w:val="FF0000"/>
                 <w:sz w:val="28"/>
                 <w:szCs w:val="28"/>
@@ -1242,7 +1303,7 @@
             <w:pPr>
               <w:jc w:val="center"/>
               <w:rPr>
-                <w:rFonts w:ascii="仿宋_GB2312" w:hAnsi="仿宋_GB2312" w:eastAsia="仿宋_GB2312" w:cs="仿宋_GB2312"/>
+                <w:rFonts w:hint="eastAsia" w:ascii="仿宋_GB2312" w:hAnsi="仿宋_GB2312" w:eastAsia="仿宋_GB2312" w:cs="仿宋_GB2312"/>
                 <w:color w:val="FF0000"/>
                 <w:sz w:val="28"/>
                 <w:szCs w:val="28"/>
@@ -1274,9 +1335,12 @@
             <w:pPr>
               <w:spacing w:before="0" w:after="0" w:line="240" w:lineRule="auto"/>
               <w:ind w:firstLine="560"/>
-            </w:pPr>
-            <w:bookmarkStart w:id="0" w:name="_GoBack"/>
-            <w:bookmarkEnd w:id="0"/>
+              <w:rPr>
+                <w:rFonts w:hint="eastAsia" w:ascii="仿宋_GB2312" w:hAnsi="仿宋_GB2312" w:eastAsia="仿宋_GB2312" w:cs="仿宋_GB2312"/>
+                <w:sz w:val="28"/>
+                <w:szCs w:val="28"/>
+              </w:rPr>
+            </w:pPr>
           </w:p>
         </w:tc>
       </w:tr>

</xml_diff>